<commit_message>
docs: update database reports with Bangladeshi localization and sample data
</commit_message>
<xml_diff>
--- a/DATABASE_REPORT.docx
+++ b/DATABASE_REPORT.docx
@@ -58,7 +58,7 @@
         <w:t xml:space="preserve"> </w:t>
       </w:r>
       <w:r>
-        <w:t xml:space="preserve">2026-07-01</w:t>
+        <w:t xml:space="preserve">2026-07-05 (Updated with Bangladeshi Localization)</w:t>
       </w:r>
       <w:r>
         <w:br/>
@@ -395,6 +395,25 @@
       </w:r>
       <w:r>
         <w:t xml:space="preserve">: Employers can manage multiple companies and candidates</w:t>
+      </w:r>
+    </w:p>
+    <w:p>
+      <w:pPr>
+        <w:pStyle w:val="Compact"/>
+        <w:numPr>
+          <w:ilvl w:val="0"/>
+          <w:numId w:val="1002"/>
+        </w:numPr>
+      </w:pPr>
+      <w:r>
+        <w:rPr>
+          <w:b/>
+          <w:bCs/>
+        </w:rPr>
+        <w:t xml:space="preserve">Localized for Bangladesh</w:t>
+      </w:r>
+      <w:r>
+        <w:t xml:space="preserve">: All database records, sample seeding data, seeker profiles, tech companies (e.g., Pathao, bKash, Brain Station 23), universities (e.g., BUET, Dhaka University), and locations (Dhaka, Chattogram, Sylhet) are tailored to authentic Bangladeshi identities and institutions.</w:t>
       </w:r>
     </w:p>
     <w:bookmarkEnd w:id="11"/>
@@ -12392,7 +12411,7 @@
         <w:rPr>
           <w:rStyle w:val="StringTok"/>
         </w:rPr>
-        <w:t xml:space="preserve">'alice@seeker.com'</w:t>
+        <w:t xml:space="preserve">'tanvir@seeker.com'</w:t>
       </w:r>
       <w:r>
         <w:rPr>
@@ -12521,7 +12540,7 @@
         <w:rPr>
           <w:rStyle w:val="StringTok"/>
         </w:rPr>
-        <w:t xml:space="preserve">'bob@seeker.com'</w:t>
+        <w:t xml:space="preserve">'sadia@seeker.com'</w:t>
       </w:r>
       <w:r>
         <w:rPr>
@@ -12650,7 +12669,7 @@
         <w:rPr>
           <w:rStyle w:val="StringTok"/>
         </w:rPr>
-        <w:t xml:space="preserve">'charlie@seeker.com'</w:t>
+        <w:t xml:space="preserve">'rakib@seeker.com'</w:t>
       </w:r>
       <w:r>
         <w:rPr>
@@ -12743,7 +12762,7 @@
         <w:rPr>
           <w:rStyle w:val="StringTok"/>
         </w:rPr>
-        <w:t xml:space="preserve">'diana@employer.com'</w:t>
+        <w:t xml:space="preserve">'nusrat@employer.com'</w:t>
       </w:r>
       <w:r>
         <w:rPr>
@@ -12836,7 +12855,7 @@
         <w:rPr>
           <w:rStyle w:val="StringTok"/>
         </w:rPr>
-        <w:t xml:space="preserve">'evan@employer.com'</w:t>
+        <w:t xml:space="preserve">'faysal@employer.com'</w:t>
       </w:r>
       <w:r>
         <w:rPr>
@@ -12929,7 +12948,7 @@
         <w:rPr>
           <w:rStyle w:val="StringTok"/>
         </w:rPr>
-        <w:t xml:space="preserve">'frank@admin.com'</w:t>
+        <w:t xml:space="preserve">'tukabbir@admin.com'</w:t>
       </w:r>
       <w:r>
         <w:rPr>
@@ -13022,7 +13041,7 @@
         <w:rPr>
           <w:rStyle w:val="StringTok"/>
         </w:rPr>
-        <w:t xml:space="preserve">'grace@seeker.com'</w:t>
+        <w:t xml:space="preserve">'niloy@seeker.com'</w:t>
       </w:r>
       <w:r>
         <w:rPr>
@@ -13115,7 +13134,7 @@
         <w:rPr>
           <w:rStyle w:val="StringTok"/>
         </w:rPr>
-        <w:t xml:space="preserve">'henry@seeker.com'</w:t>
+        <w:t xml:space="preserve">'sakhawat@seeker.com'</w:t>
       </w:r>
       <w:r>
         <w:rPr>
@@ -13244,7 +13263,7 @@
         <w:rPr>
           <w:rStyle w:val="StringTok"/>
         </w:rPr>
-        <w:t xml:space="preserve">'isla@employer.com'</w:t>
+        <w:t xml:space="preserve">'animesh@employer.com'</w:t>
       </w:r>
       <w:r>
         <w:rPr>
@@ -13337,7 +13356,7 @@
         <w:rPr>
           <w:rStyle w:val="StringTok"/>
         </w:rPr>
-        <w:t xml:space="preserve">'jack@seeker.com'</w:t>
+        <w:t xml:space="preserve">'mohammad@seeker.com'</w:t>
       </w:r>
       <w:r>
         <w:rPr>
@@ -13432,7 +13451,7 @@
         <w:rPr>
           <w:rStyle w:val="VerbatimChar"/>
         </w:rPr>
-        <w:t xml:space="preserve"> 550e8400-e29b-41d4-a716-446655440001 | alice@seeker.com    | seeker    | 2026-06-01 12:00:00 UTC | 2026-06-29 12:00:00 UTC</w:t>
+        <w:t xml:space="preserve"> 550e8400-e29b-41d4-a716-446655440001 | tanvir@seeker.com    | seeker    | 2026-06-01 12:00:00 UTC | 2026-06-29 12:00:00 UTC</w:t>
       </w:r>
       <w:r>
         <w:br/>
@@ -13441,7 +13460,7 @@
         <w:rPr>
           <w:rStyle w:val="VerbatimChar"/>
         </w:rPr>
-        <w:t xml:space="preserve"> 550e8400-e29b-41d4-a716-446655440002 | bob@seeker.com      | seeker    | 2026-06-06 12:00:00 UTC | 2026-06-30 12:00:00 UTC</w:t>
+        <w:t xml:space="preserve"> 550e8400-e29b-41d4-a716-446655440002 | sadia@seeker.com      | seeker    | 2026-06-06 12:00:00 UTC | 2026-06-30 12:00:00 UTC</w:t>
       </w:r>
       <w:r>
         <w:br/>
@@ -13450,7 +13469,7 @@
         <w:rPr>
           <w:rStyle w:val="VerbatimChar"/>
         </w:rPr>
-        <w:t xml:space="preserve"> 550e8400-e29b-41d4-a716-446655440003 | charlie@seeker.com  | seeker    | 2026-06-11 12:00:00 UTC | 2026-07-01 12:00:00 UTC</w:t>
+        <w:t xml:space="preserve"> 550e8400-e29b-41d4-a716-446655440003 | rakib@seeker.com  | seeker    | 2026-06-11 12:00:00 UTC | 2026-07-01 12:00:00 UTC</w:t>
       </w:r>
       <w:r>
         <w:br/>
@@ -13459,7 +13478,7 @@
         <w:rPr>
           <w:rStyle w:val="VerbatimChar"/>
         </w:rPr>
-        <w:t xml:space="preserve"> 550e8400-e29b-41d4-a716-446655440004 | diana@employer.com  | employer  | 2026-05-02 12:00:00 UTC | 2026-07-01 12:00:00 UTC</w:t>
+        <w:t xml:space="preserve"> 550e8400-e29b-41d4-a716-446655440004 | nusrat@employer.com  | employer  | 2026-05-02 12:00:00 UTC | 2026-07-01 12:00:00 UTC</w:t>
       </w:r>
       <w:r>
         <w:br/>
@@ -13468,7 +13487,7 @@
         <w:rPr>
           <w:rStyle w:val="VerbatimChar"/>
         </w:rPr>
-        <w:t xml:space="preserve"> 550e8400-e29b-41d4-a716-446655440005 | evan@employer.com   | employer  | 2026-05-12 12:00:00 UTC | 2026-07-01 12:00:00 UTC</w:t>
+        <w:t xml:space="preserve"> 550e8400-e29b-41d4-a716-446655440005 | faysal@employer.com   | employer  | 2026-05-12 12:00:00 UTC | 2026-07-01 12:00:00 UTC</w:t>
       </w:r>
       <w:r>
         <w:br/>
@@ -13477,7 +13496,7 @@
         <w:rPr>
           <w:rStyle w:val="VerbatimChar"/>
         </w:rPr>
-        <w:t xml:space="preserve"> 550e8400-e29b-41d4-a716-446655440006 | frank@admin.com     | admin     | 2026-03-23 12:00:00 UTC | 2026-07-01 12:00:00 UTC</w:t>
+        <w:t xml:space="preserve"> 550e8400-e29b-41d4-a716-446655440006 | tukabbir@admin.com     | admin     | 2026-03-23 12:00:00 UTC | 2026-07-01 12:00:00 UTC</w:t>
       </w:r>
       <w:r>
         <w:br/>
@@ -13486,7 +13505,7 @@
         <w:rPr>
           <w:rStyle w:val="VerbatimChar"/>
         </w:rPr>
-        <w:t xml:space="preserve"> 550e8400-e29b-41d4-a716-446655440007 | grace@seeker.com    | seeker    | 2026-06-16 12:00:00 UTC | 2026-07-01 12:00:00 UTC</w:t>
+        <w:t xml:space="preserve"> 550e8400-e29b-41d4-a716-446655440007 | niloy@seeker.com    | seeker    | 2026-06-16 12:00:00 UTC | 2026-07-01 12:00:00 UTC</w:t>
       </w:r>
       <w:r>
         <w:br/>
@@ -13495,7 +13514,7 @@
         <w:rPr>
           <w:rStyle w:val="VerbatimChar"/>
         </w:rPr>
-        <w:t xml:space="preserve"> 550e8400-e29b-41d4-a716-446655440008 | henry@seeker.com    | seeker    | 2026-06-21 12:00:00 UTC | 2026-06-26 12:00:00 UTC</w:t>
+        <w:t xml:space="preserve"> 550e8400-e29b-41d4-a716-446655440008 | sakhawat@seeker.com    | seeker    | 2026-06-21 12:00:00 UTC | 2026-06-26 12:00:00 UTC</w:t>
       </w:r>
       <w:r>
         <w:br/>
@@ -13504,7 +13523,7 @@
         <w:rPr>
           <w:rStyle w:val="VerbatimChar"/>
         </w:rPr>
-        <w:t xml:space="preserve"> 550e8400-e29b-41d4-a716-446655440009 | isla@employer.com   | employer  | 2026-05-22 12:00:00 UTC | 2026-07-01 12:00:00 UTC</w:t>
+        <w:t xml:space="preserve"> 550e8400-e29b-41d4-a716-446655440009 | animesh@employer.com   | employer  | 2026-05-22 12:00:00 UTC | 2026-07-01 12:00:00 UTC</w:t>
       </w:r>
       <w:r>
         <w:br/>
@@ -13513,7 +13532,7 @@
         <w:rPr>
           <w:rStyle w:val="VerbatimChar"/>
         </w:rPr>
-        <w:t xml:space="preserve"> 550e8400-e29b-41d4-a716-446655440010 | jack@seeker.com     | seeker    | 2026-06-26 12:00:00 UTC | 2026-07-01 12:00:00 UTC</w:t>
+        <w:t xml:space="preserve"> 550e8400-e29b-41d4-a716-446655440010 | mohammad@seeker.com     | seeker    | 2026-06-26 12:00:00 UTC | 2026-07-01 12:00:00 UTC</w:t>
       </w:r>
     </w:p>
     <w:bookmarkEnd w:id="44"/>
@@ -13621,7 +13640,7 @@
         <w:rPr>
           <w:rStyle w:val="StringTok"/>
         </w:rPr>
-        <w:t xml:space="preserve">'TechCorp Industries'</w:t>
+        <w:t xml:space="preserve">'Pathao'</w:t>
       </w:r>
       <w:r>
         <w:rPr>
@@ -13657,7 +13676,7 @@
         <w:rPr>
           <w:rStyle w:val="StringTok"/>
         </w:rPr>
-        <w:t xml:space="preserve">'https://techcorp.com'</w:t>
+        <w:t xml:space="preserve">'https://pathao.com'</w:t>
       </w:r>
       <w:r>
         <w:rPr>
@@ -13669,7 +13688,7 @@
         <w:rPr>
           <w:rStyle w:val="StringTok"/>
         </w:rPr>
-        <w:t xml:space="preserve">'https://logo.techcorp.com'</w:t>
+        <w:t xml:space="preserve">'https://logo.pathao.com'</w:t>
       </w:r>
       <w:r>
         <w:rPr>
@@ -13726,7 +13745,7 @@
         <w:rPr>
           <w:rStyle w:val="StringTok"/>
         </w:rPr>
-        <w:t xml:space="preserve">'InnovateLabs'</w:t>
+        <w:t xml:space="preserve">'bKash'</w:t>
       </w:r>
       <w:r>
         <w:rPr>
@@ -13762,7 +13781,7 @@
         <w:rPr>
           <w:rStyle w:val="StringTok"/>
         </w:rPr>
-        <w:t xml:space="preserve">'https://innovatelabs.com'</w:t>
+        <w:t xml:space="preserve">'https://bkash.com'</w:t>
       </w:r>
       <w:r>
         <w:rPr>
@@ -13774,7 +13793,7 @@
         <w:rPr>
           <w:rStyle w:val="StringTok"/>
         </w:rPr>
-        <w:t xml:space="preserve">'https://logo.innovatelabs.com'</w:t>
+        <w:t xml:space="preserve">'https://logo.bkash.com'</w:t>
       </w:r>
       <w:r>
         <w:rPr>
@@ -13831,7 +13850,7 @@
         <w:rPr>
           <w:rStyle w:val="StringTok"/>
         </w:rPr>
-        <w:t xml:space="preserve">'DesignStudio'</w:t>
+        <w:t xml:space="preserve">'Brain Station 23'</w:t>
       </w:r>
       <w:r>
         <w:rPr>
@@ -13867,7 +13886,7 @@
         <w:rPr>
           <w:rStyle w:val="StringTok"/>
         </w:rPr>
-        <w:t xml:space="preserve">'https://designstudio.com'</w:t>
+        <w:t xml:space="preserve">'https://brainstation23.com'</w:t>
       </w:r>
       <w:r>
         <w:rPr>
@@ -13879,7 +13898,7 @@
         <w:rPr>
           <w:rStyle w:val="StringTok"/>
         </w:rPr>
-        <w:t xml:space="preserve">'https://logo.designstudio.com'</w:t>
+        <w:t xml:space="preserve">'https://logo.brainstation23.com'</w:t>
       </w:r>
       <w:r>
         <w:rPr>
@@ -13936,7 +13955,7 @@
         <w:rPr>
           <w:rStyle w:val="StringTok"/>
         </w:rPr>
-        <w:t xml:space="preserve">'DataViz Corp'</w:t>
+        <w:t xml:space="preserve">'TigerIT'</w:t>
       </w:r>
       <w:r>
         <w:rPr>
@@ -13972,7 +13991,7 @@
         <w:rPr>
           <w:rStyle w:val="StringTok"/>
         </w:rPr>
-        <w:t xml:space="preserve">'https://dataviz.com'</w:t>
+        <w:t xml:space="preserve">'https://tigerit.com'</w:t>
       </w:r>
       <w:r>
         <w:rPr>
@@ -13984,7 +14003,7 @@
         <w:rPr>
           <w:rStyle w:val="StringTok"/>
         </w:rPr>
-        <w:t xml:space="preserve">'https://logo.dataviz.com'</w:t>
+        <w:t xml:space="preserve">'https://logo.tigerit.com'</w:t>
       </w:r>
       <w:r>
         <w:rPr>
@@ -14041,7 +14060,7 @@
         <w:rPr>
           <w:rStyle w:val="StringTok"/>
         </w:rPr>
-        <w:t xml:space="preserve">'CloudStack'</w:t>
+        <w:t xml:space="preserve">'Enosis Solutions'</w:t>
       </w:r>
       <w:r>
         <w:rPr>
@@ -14077,7 +14096,7 @@
         <w:rPr>
           <w:rStyle w:val="StringTok"/>
         </w:rPr>
-        <w:t xml:space="preserve">'https://cloudstack.com'</w:t>
+        <w:t xml:space="preserve">'https://enosis.com'</w:t>
       </w:r>
       <w:r>
         <w:rPr>
@@ -14089,7 +14108,7 @@
         <w:rPr>
           <w:rStyle w:val="StringTok"/>
         </w:rPr>
-        <w:t xml:space="preserve">'https://logo.cloudstack.com'</w:t>
+        <w:t xml:space="preserve">'https://logo.enosis.com'</w:t>
       </w:r>
       <w:r>
         <w:rPr>
@@ -14148,7 +14167,7 @@
         <w:rPr>
           <w:rStyle w:val="VerbatimChar"/>
         </w:rPr>
-        <w:t xml:space="preserve"> 660e8400-e29b-41d4-a716-446655440001 | TechCorp Industries| Technology         | Leading software development ... | https://techcorp.com   | 2010</w:t>
+        <w:t xml:space="preserve"> 660e8400-e29b-41d4-a716-446655440001 | Pathao| Technology         | Leading software development ... | https://pathao.com   | 2010</w:t>
       </w:r>
       <w:r>
         <w:br/>
@@ -14157,7 +14176,7 @@
         <w:rPr>
           <w:rStyle w:val="VerbatimChar"/>
         </w:rPr>
-        <w:t xml:space="preserve"> 660e8400-e29b-41d4-a716-446655440002 | InnovateLabs       | Software/AI        | AI and machine learning sol ...  | https://innovatelabs.com| 2015</w:t>
+        <w:t xml:space="preserve"> 660e8400-e29b-41d4-a716-446655440002 | bKash       | Software/AI        | AI and machine learning sol ...  | https://bkash.com| 2015</w:t>
       </w:r>
       <w:r>
         <w:br/>
@@ -14166,7 +14185,7 @@
         <w:rPr>
           <w:rStyle w:val="VerbatimChar"/>
         </w:rPr>
-        <w:t xml:space="preserve"> 660e8400-e29b-41d4-a716-446655440003 | DesignStudio       | Design/Creative    | Digital design and UX agency ...| https://designstudio.com| 2012</w:t>
+        <w:t xml:space="preserve"> 660e8400-e29b-41d4-a716-446655440003 | Brain Station 23       | Design/Creative    | Digital design and UX agency ...| https://brainstation23.com| 2012</w:t>
       </w:r>
       <w:r>
         <w:br/>
@@ -14175,7 +14194,7 @@
         <w:rPr>
           <w:rStyle w:val="VerbatimChar"/>
         </w:rPr>
-        <w:t xml:space="preserve"> 660e8400-e29b-41d4-a716-446655440004 | DataViz Corp       | Data Analytics     | Business intelligence solutions  | https://dataviz.com    | 2018</w:t>
+        <w:t xml:space="preserve"> 660e8400-e29b-41d4-a716-446655440004 | TigerIT       | Data Analytics     | Business intelligence solutions  | https://tigerit.com    | 2018</w:t>
       </w:r>
       <w:r>
         <w:br/>
@@ -14184,7 +14203,7 @@
         <w:rPr>
           <w:rStyle w:val="VerbatimChar"/>
         </w:rPr>
-        <w:t xml:space="preserve"> 660e8400-e29b-41d4-a716-446655440005 | CloudStack         | Cloud Services     | Cloud infrastructure provider    | https://cloudstack.com | 2008</w:t>
+        <w:t xml:space="preserve"> 660e8400-e29b-41d4-a716-446655440005 | Enosis Solutions         | Cloud Services     | Cloud infrastructure provider    | https://enosis.com | 2008</w:t>
       </w:r>
     </w:p>
     <w:bookmarkEnd w:id="45"/>
@@ -15185,7 +15204,7 @@
         <w:rPr>
           <w:rStyle w:val="StringTok"/>
         </w:rPr>
-        <w:t xml:space="preserve">'Alice'</w:t>
+        <w:t xml:space="preserve">'Tanvir'</w:t>
       </w:r>
       <w:r>
         <w:rPr>
@@ -15197,7 +15216,7 @@
         <w:rPr>
           <w:rStyle w:val="StringTok"/>
         </w:rPr>
-        <w:t xml:space="preserve">'Johnson'</w:t>
+        <w:t xml:space="preserve">'Rahman'</w:t>
       </w:r>
       <w:r>
         <w:rPr>
@@ -15233,7 +15252,7 @@
         <w:rPr>
           <w:rStyle w:val="StringTok"/>
         </w:rPr>
-        <w:t xml:space="preserve">'San Francisco, CA'</w:t>
+        <w:t xml:space="preserve">'Dhaka, Bangladesh'</w:t>
       </w:r>
       <w:r>
         <w:rPr>
@@ -15245,7 +15264,7 @@
         <w:rPr>
           <w:rStyle w:val="StringTok"/>
         </w:rPr>
-        <w:t xml:space="preserve">'https://resume.alice.pdf'</w:t>
+        <w:t xml:space="preserve">'https://resume.tanvir.pdf'</w:t>
       </w:r>
       <w:r>
         <w:rPr>
@@ -15257,7 +15276,7 @@
         <w:rPr>
           <w:rStyle w:val="StringTok"/>
         </w:rPr>
-        <w:t xml:space="preserve">'https://github.com/alice'</w:t>
+        <w:t xml:space="preserve">'https://github.com/tanvir'</w:t>
       </w:r>
       <w:r>
         <w:rPr>
@@ -15269,7 +15288,7 @@
         <w:rPr>
           <w:rStyle w:val="StringTok"/>
         </w:rPr>
-        <w:t xml:space="preserve">'https://avatar.alice.jpg'</w:t>
+        <w:t xml:space="preserve">'https://avatar.tanvir.jpg'</w:t>
       </w:r>
       <w:r>
         <w:rPr>
@@ -15350,7 +15369,7 @@
         <w:rPr>
           <w:rStyle w:val="StringTok"/>
         </w:rPr>
-        <w:t xml:space="preserve">'Bob'</w:t>
+        <w:t xml:space="preserve">'Sadia'</w:t>
       </w:r>
       <w:r>
         <w:rPr>
@@ -15362,7 +15381,7 @@
         <w:rPr>
           <w:rStyle w:val="StringTok"/>
         </w:rPr>
-        <w:t xml:space="preserve">'Smith'</w:t>
+        <w:t xml:space="preserve">'Begum'</w:t>
       </w:r>
       <w:r>
         <w:rPr>
@@ -15398,7 +15417,7 @@
         <w:rPr>
           <w:rStyle w:val="StringTok"/>
         </w:rPr>
-        <w:t xml:space="preserve">'New York, NY'</w:t>
+        <w:t xml:space="preserve">'Banani, Dhaka'</w:t>
       </w:r>
       <w:r>
         <w:rPr>
@@ -15410,7 +15429,7 @@
         <w:rPr>
           <w:rStyle w:val="StringTok"/>
         </w:rPr>
-        <w:t xml:space="preserve">'https://resume.bob.pdf'</w:t>
+        <w:t xml:space="preserve">'https://resume.sadia.pdf'</w:t>
       </w:r>
       <w:r>
         <w:rPr>
@@ -15422,7 +15441,7 @@
         <w:rPr>
           <w:rStyle w:val="StringTok"/>
         </w:rPr>
-        <w:t xml:space="preserve">'https://github.com/bob'</w:t>
+        <w:t xml:space="preserve">'https://github.com/sadia'</w:t>
       </w:r>
       <w:r>
         <w:rPr>
@@ -15434,7 +15453,7 @@
         <w:rPr>
           <w:rStyle w:val="StringTok"/>
         </w:rPr>
-        <w:t xml:space="preserve">'https://avatar.bob.jpg'</w:t>
+        <w:t xml:space="preserve">'https://avatar.sadia.jpg'</w:t>
       </w:r>
       <w:r>
         <w:rPr>
@@ -15515,7 +15534,7 @@
         <w:rPr>
           <w:rStyle w:val="StringTok"/>
         </w:rPr>
-        <w:t xml:space="preserve">'Charlie'</w:t>
+        <w:t xml:space="preserve">'Rakib'</w:t>
       </w:r>
       <w:r>
         <w:rPr>
@@ -15527,7 +15546,7 @@
         <w:rPr>
           <w:rStyle w:val="StringTok"/>
         </w:rPr>
-        <w:t xml:space="preserve">'Brown'</w:t>
+        <w:t xml:space="preserve">'Ghosh'</w:t>
       </w:r>
       <w:r>
         <w:rPr>
@@ -15563,7 +15582,7 @@
         <w:rPr>
           <w:rStyle w:val="StringTok"/>
         </w:rPr>
-        <w:t xml:space="preserve">'Austin, TX'</w:t>
+        <w:t xml:space="preserve">'Chattogram, Bangladesh'</w:t>
       </w:r>
       <w:r>
         <w:rPr>
@@ -15575,7 +15594,7 @@
         <w:rPr>
           <w:rStyle w:val="StringTok"/>
         </w:rPr>
-        <w:t xml:space="preserve">'https://resume.charlie.pdf'</w:t>
+        <w:t xml:space="preserve">'https://resume.rakib.pdf'</w:t>
       </w:r>
       <w:r>
         <w:rPr>
@@ -15587,7 +15606,7 @@
         <w:rPr>
           <w:rStyle w:val="StringTok"/>
         </w:rPr>
-        <w:t xml:space="preserve">'https://github.com/charlie'</w:t>
+        <w:t xml:space="preserve">'https://github.com/rakib'</w:t>
       </w:r>
       <w:r>
         <w:rPr>
@@ -15599,7 +15618,7 @@
         <w:rPr>
           <w:rStyle w:val="StringTok"/>
         </w:rPr>
-        <w:t xml:space="preserve">'https://avatar.charlie.jpg'</w:t>
+        <w:t xml:space="preserve">'https://avatar.rakib.jpg'</w:t>
       </w:r>
       <w:r>
         <w:rPr>
@@ -15680,7 +15699,7 @@
         <w:rPr>
           <w:rStyle w:val="StringTok"/>
         </w:rPr>
-        <w:t xml:space="preserve">'Grace'</w:t>
+        <w:t xml:space="preserve">'Niloy'</w:t>
       </w:r>
       <w:r>
         <w:rPr>
@@ -15692,7 +15711,7 @@
         <w:rPr>
           <w:rStyle w:val="StringTok"/>
         </w:rPr>
-        <w:t xml:space="preserve">'Lee'</w:t>
+        <w:t xml:space="preserve">'Mukherjee'</w:t>
       </w:r>
       <w:r>
         <w:rPr>
@@ -15728,7 +15747,7 @@
         <w:rPr>
           <w:rStyle w:val="StringTok"/>
         </w:rPr>
-        <w:t xml:space="preserve">'Seattle, WA'</w:t>
+        <w:t xml:space="preserve">'Gulshan, Dhaka'</w:t>
       </w:r>
       <w:r>
         <w:rPr>
@@ -15740,7 +15759,7 @@
         <w:rPr>
           <w:rStyle w:val="StringTok"/>
         </w:rPr>
-        <w:t xml:space="preserve">'https://resume.grace.pdf'</w:t>
+        <w:t xml:space="preserve">'https://resume.niloy.pdf'</w:t>
       </w:r>
       <w:r>
         <w:rPr>
@@ -15764,7 +15783,7 @@
         <w:rPr>
           <w:rStyle w:val="StringTok"/>
         </w:rPr>
-        <w:t xml:space="preserve">'https://avatar.grace.jpg'</w:t>
+        <w:t xml:space="preserve">'https://avatar.niloy.jpg'</w:t>
       </w:r>
       <w:r>
         <w:rPr>
@@ -15845,7 +15864,7 @@
         <w:rPr>
           <w:rStyle w:val="StringTok"/>
         </w:rPr>
-        <w:t xml:space="preserve">'Henry'</w:t>
+        <w:t xml:space="preserve">'Sakhawat'</w:t>
       </w:r>
       <w:r>
         <w:rPr>
@@ -15857,7 +15876,7 @@
         <w:rPr>
           <w:rStyle w:val="StringTok"/>
         </w:rPr>
-        <w:t xml:space="preserve">'Wilson'</w:t>
+        <w:t xml:space="preserve">'Hosen'</w:t>
       </w:r>
       <w:r>
         <w:rPr>
@@ -15893,7 +15912,7 @@
         <w:rPr>
           <w:rStyle w:val="StringTok"/>
         </w:rPr>
-        <w:t xml:space="preserve">'Boston, MA'</w:t>
+        <w:t xml:space="preserve">'Sylhet, Bangladesh'</w:t>
       </w:r>
       <w:r>
         <w:rPr>
@@ -15905,7 +15924,7 @@
         <w:rPr>
           <w:rStyle w:val="StringTok"/>
         </w:rPr>
-        <w:t xml:space="preserve">'https://resume.henry.pdf'</w:t>
+        <w:t xml:space="preserve">'https://resume.sakhawat.pdf'</w:t>
       </w:r>
       <w:r>
         <w:rPr>
@@ -15917,7 +15936,7 @@
         <w:rPr>
           <w:rStyle w:val="StringTok"/>
         </w:rPr>
-        <w:t xml:space="preserve">'https://github.com/henry'</w:t>
+        <w:t xml:space="preserve">'https://github.com/sakhawat'</w:t>
       </w:r>
       <w:r>
         <w:rPr>
@@ -15929,7 +15948,7 @@
         <w:rPr>
           <w:rStyle w:val="StringTok"/>
         </w:rPr>
-        <w:t xml:space="preserve">'https://avatar.henry.jpg'</w:t>
+        <w:t xml:space="preserve">'https://avatar.sakhawat.jpg'</w:t>
       </w:r>
       <w:r>
         <w:rPr>
@@ -16010,7 +16029,7 @@
         <w:rPr>
           <w:rStyle w:val="StringTok"/>
         </w:rPr>
-        <w:t xml:space="preserve">'Jack'</w:t>
+        <w:t xml:space="preserve">'Mohammad'</w:t>
       </w:r>
       <w:r>
         <w:rPr>
@@ -16022,7 +16041,7 @@
         <w:rPr>
           <w:rStyle w:val="StringTok"/>
         </w:rPr>
-        <w:t xml:space="preserve">'Davis'</w:t>
+        <w:t xml:space="preserve">'Sakhawat'</w:t>
       </w:r>
       <w:r>
         <w:rPr>
@@ -16058,7 +16077,7 @@
         <w:rPr>
           <w:rStyle w:val="StringTok"/>
         </w:rPr>
-        <w:t xml:space="preserve">'Denver, CO'</w:t>
+        <w:t xml:space="preserve">'Mirpur, Dhaka'</w:t>
       </w:r>
       <w:r>
         <w:rPr>
@@ -16070,7 +16089,7 @@
         <w:rPr>
           <w:rStyle w:val="StringTok"/>
         </w:rPr>
-        <w:t xml:space="preserve">'https://resume.jack.pdf'</w:t>
+        <w:t xml:space="preserve">'https://resume.mohammad.pdf'</w:t>
       </w:r>
       <w:r>
         <w:rPr>
@@ -16082,7 +16101,7 @@
         <w:rPr>
           <w:rStyle w:val="StringTok"/>
         </w:rPr>
-        <w:t xml:space="preserve">'https://github.com/jack'</w:t>
+        <w:t xml:space="preserve">'https://github.com/mohammad'</w:t>
       </w:r>
       <w:r>
         <w:rPr>
@@ -16094,7 +16113,7 @@
         <w:rPr>
           <w:rStyle w:val="StringTok"/>
         </w:rPr>
-        <w:t xml:space="preserve">'https://avatar.jack.jpg'</w:t>
+        <w:t xml:space="preserve">'https://avatar.mohammad.jpg'</w:t>
       </w:r>
       <w:r>
         <w:rPr>
@@ -16177,7 +16196,7 @@
         <w:rPr>
           <w:rStyle w:val="VerbatimChar"/>
         </w:rPr>
-        <w:t xml:space="preserve"> 550e8400-e29b-41d4-a716-446655440001 | Alice      | Johnson   | Full Stack Developer    | San Francisco, CA  | 4</w:t>
+        <w:t xml:space="preserve"> 550e8400-e29b-41d4-a716-446655440001 | Tanvir      | Rahman   | Full Stack Developer    | Dhaka, Bangladesh  | 4</w:t>
       </w:r>
       <w:r>
         <w:br/>
@@ -16186,7 +16205,7 @@
         <w:rPr>
           <w:rStyle w:val="VerbatimChar"/>
         </w:rPr>
-        <w:t xml:space="preserve"> 550e8400-e29b-41d4-a716-446655440002 | Bob        | Smith     | Junior Backend Engineer | New York, NY       | 1</w:t>
+        <w:t xml:space="preserve"> 550e8400-e29b-41d4-a716-446655440002 | Sadia        | Begum     | Junior Backend Engineer | Banani, Dhaka       | 1</w:t>
       </w:r>
       <w:r>
         <w:br/>
@@ -16195,7 +16214,7 @@
         <w:rPr>
           <w:rStyle w:val="VerbatimChar"/>
         </w:rPr>
-        <w:t xml:space="preserve"> 550e8400-e29b-41d4-a716-446655440003 | Charlie    | Brown     | Data Scientist          | Austin, TX         | 5</w:t>
+        <w:t xml:space="preserve"> 550e8400-e29b-41d4-a716-446655440003 | Rakib    | Ghosh     | Data Scientist          | Chattogram, Bangladesh         | 5</w:t>
       </w:r>
       <w:r>
         <w:br/>
@@ -16204,7 +16223,7 @@
         <w:rPr>
           <w:rStyle w:val="VerbatimChar"/>
         </w:rPr>
-        <w:t xml:space="preserve"> 550e8400-e29b-41d4-a716-446655440007 | Grace      | Lee       | UI/UX Designer          | Seattle, WA        | 3</w:t>
+        <w:t xml:space="preserve"> 550e8400-e29b-41d4-a716-446655440007 | Niloy      | Mukherjee       | UI/UX Designer          | Gulshan, Dhaka        | 3</w:t>
       </w:r>
       <w:r>
         <w:br/>
@@ -16213,7 +16232,7 @@
         <w:rPr>
           <w:rStyle w:val="VerbatimChar"/>
         </w:rPr>
-        <w:t xml:space="preserve"> 550e8400-e29b-41d4-a716-446655440008 | Henry      | Wilson    | DevOps Engineer         | Boston, MA         | 3</w:t>
+        <w:t xml:space="preserve"> 550e8400-e29b-41d4-a716-446655440008 | Sakhawat      | Hosen    | DevOps Engineer         | Sylhet, Bangladesh         | 3</w:t>
       </w:r>
       <w:r>
         <w:br/>
@@ -16222,7 +16241,7 @@
         <w:rPr>
           <w:rStyle w:val="VerbatimChar"/>
         </w:rPr>
-        <w:t xml:space="preserve"> 550e8400-e29b-41d4-a716-446655440010 | Jack       | Davis     | Full Stack Developer    | Denver, CO         | 2</w:t>
+        <w:t xml:space="preserve"> 550e8400-e29b-41d4-a716-446655440010 | Mohammad       | Sakhawat     | Full Stack Developer    | Mirpur, Dhaka         | 2</w:t>
       </w:r>
     </w:p>
     <w:bookmarkEnd w:id="47"/>
@@ -16288,7 +16307,7 @@
         <w:rPr>
           <w:rStyle w:val="CommentTok"/>
         </w:rPr>
-        <w:t xml:space="preserve">-- Alice (Full Stack)</w:t>
+        <w:t xml:space="preserve">-- Tanvir (Full Stack)</w:t>
       </w:r>
       <w:r>
         <w:br/>
@@ -16561,7 +16580,7 @@
         <w:rPr>
           <w:rStyle w:val="CommentTok"/>
         </w:rPr>
-        <w:t xml:space="preserve">-- Bob (Junior Backend)</w:t>
+        <w:t xml:space="preserve">-- Sadia (Junior Backend)</w:t>
       </w:r>
       <w:r>
         <w:br/>
@@ -16834,7 +16853,7 @@
         <w:rPr>
           <w:rStyle w:val="CommentTok"/>
         </w:rPr>
-        <w:t xml:space="preserve">-- Charlie (Data Scientist)</w:t>
+        <w:t xml:space="preserve">-- Rakib (Data Scientist)</w:t>
       </w:r>
       <w:r>
         <w:br/>
@@ -17107,7 +17126,7 @@
         <w:rPr>
           <w:rStyle w:val="CommentTok"/>
         </w:rPr>
-        <w:t xml:space="preserve">-- Grace (Designer)</w:t>
+        <w:t xml:space="preserve">-- Niloy (Designer)</w:t>
       </w:r>
       <w:r>
         <w:br/>
@@ -17293,7 +17312,7 @@
         <w:rPr>
           <w:rStyle w:val="CommentTok"/>
         </w:rPr>
-        <w:t xml:space="preserve">-- Henry (DevOps)</w:t>
+        <w:t xml:space="preserve">-- Sakhawat (DevOps)</w:t>
       </w:r>
       <w:r>
         <w:br/>
@@ -17479,7 +17498,7 @@
         <w:rPr>
           <w:rStyle w:val="CommentTok"/>
         </w:rPr>
-        <w:t xml:space="preserve">-- Jack (Full Stack)</w:t>
+        <w:t xml:space="preserve">-- Mohammad (Full Stack)</w:t>
       </w:r>
       <w:r>
         <w:br/>
@@ -18096,7 +18115,7 @@
         <w:rPr>
           <w:rStyle w:val="StringTok"/>
         </w:rPr>
-        <w:t xml:space="preserve">'San Francisco, CA'</w:t>
+        <w:t xml:space="preserve">'Dhaka, Bangladesh'</w:t>
       </w:r>
       <w:r>
         <w:rPr>
@@ -18498,7 +18517,7 @@
         <w:rPr>
           <w:rStyle w:val="StringTok"/>
         </w:rPr>
-        <w:t xml:space="preserve">'Boston, MA'</w:t>
+        <w:t xml:space="preserve">'Sylhet, Bangladesh'</w:t>
       </w:r>
       <w:r>
         <w:rPr>
@@ -18699,7 +18718,7 @@
         <w:rPr>
           <w:rStyle w:val="StringTok"/>
         </w:rPr>
-        <w:t xml:space="preserve">'Seattle, WA'</w:t>
+        <w:t xml:space="preserve">'Gulshan, Dhaka'</w:t>
       </w:r>
       <w:r>
         <w:rPr>
@@ -18900,7 +18919,7 @@
         <w:rPr>
           <w:rStyle w:val="StringTok"/>
         </w:rPr>
-        <w:t xml:space="preserve">'New York, NY'</w:t>
+        <w:t xml:space="preserve">'Banani, Dhaka'</w:t>
       </w:r>
       <w:r>
         <w:rPr>
@@ -19101,7 +19120,7 @@
         <w:rPr>
           <w:rStyle w:val="StringTok"/>
         </w:rPr>
-        <w:t xml:space="preserve">'Austin, TX'</w:t>
+        <w:t xml:space="preserve">'Chattogram, Bangladesh'</w:t>
       </w:r>
       <w:r>
         <w:rPr>
@@ -19232,7 +19251,7 @@
         <w:rPr>
           <w:rStyle w:val="VerbatimChar"/>
         </w:rPr>
-        <w:t xml:space="preserve"> 880e8400-e29b-41d4-a716-446655440001 | TechCorp Industries | Senior React Developer | San Francisco, CA  | 120000     | 150000     | full_time | open</w:t>
+        <w:t xml:space="preserve"> 880e8400-e29b-41d4-a716-446655440001 | Pathao | Senior React Developer | Dhaka, Bangladesh  | 120000     | 150000     | full_time | open</w:t>
       </w:r>
       <w:r>
         <w:br/>
@@ -19241,7 +19260,7 @@
         <w:rPr>
           <w:rStyle w:val="VerbatimChar"/>
         </w:rPr>
-        <w:t xml:space="preserve"> 880e8400-e29b-41d4-a716-446655440002 | TechCorp Industries | Backend Engineer       | Remote             | 100000     | 130000     | remote    | open</w:t>
+        <w:t xml:space="preserve"> 880e8400-e29b-41d4-a716-446655440002 | Pathao | Backend Engineer       | Remote             | 100000     | 130000     | remote    | open</w:t>
       </w:r>
       <w:r>
         <w:br/>
@@ -19250,7 +19269,7 @@
         <w:rPr>
           <w:rStyle w:val="VerbatimChar"/>
         </w:rPr>
-        <w:t xml:space="preserve"> 880e8400-e29b-41d4-a716-446655440003 | InnovateLabs        | Machine Learning Eng   | Boston, MA         | 130000     | 160000     | full_time | open</w:t>
+        <w:t xml:space="preserve"> 880e8400-e29b-41d4-a716-446655440003 | bKash        | Machine Learning Eng   | Sylhet, Bangladesh         | 130000     | 160000     | full_time | open</w:t>
       </w:r>
       <w:r>
         <w:br/>
@@ -19259,7 +19278,7 @@
         <w:rPr>
           <w:rStyle w:val="VerbatimChar"/>
         </w:rPr>
-        <w:t xml:space="preserve"> 880e8400-e29b-41d4-a716-446655440004 | DesignStudio        | UI/UX Designer         | Seattle, WA        | 90000      | 120000     | full_time | open</w:t>
+        <w:t xml:space="preserve"> 880e8400-e29b-41d4-a716-446655440004 | Brain Station 23        | UI/UX Designer         | Gulshan, Dhaka        | 90000      | 120000     | full_time | open</w:t>
       </w:r>
       <w:r>
         <w:br/>
@@ -19268,7 +19287,7 @@
         <w:rPr>
           <w:rStyle w:val="VerbatimChar"/>
         </w:rPr>
-        <w:t xml:space="preserve"> 880e8400-e29b-41d4-a716-446655440005 | CloudStack          | DevOps Engineer        | New York, NY       | 110000     | 140000     | full_time | open</w:t>
+        <w:t xml:space="preserve"> 880e8400-e29b-41d4-a716-446655440005 | Enosis Solutions          | DevOps Engineer        | Banani, Dhaka       | 110000     | 140000     | full_time | open</w:t>
       </w:r>
       <w:r>
         <w:br/>
@@ -19277,7 +19296,7 @@
         <w:rPr>
           <w:rStyle w:val="VerbatimChar"/>
         </w:rPr>
-        <w:t xml:space="preserve"> 880e8400-e29b-41d4-a716-446655440006 | TechCorp Industries | Python Developer       | Austin, TX         | 85000      | 110000     | full_time | closed</w:t>
+        <w:t xml:space="preserve"> 880e8400-e29b-41d4-a716-446655440006 | Pathao | Python Developer       | Chattogram, Bangladesh         | 85000      | 110000     | full_time | closed</w:t>
       </w:r>
     </w:p>
     <w:bookmarkEnd w:id="49"/>
@@ -21933,7 +21952,7 @@
         <w:rPr>
           <w:rStyle w:val="VerbatimChar"/>
         </w:rPr>
-        <w:t xml:space="preserve"> 990e8400-e29b-41d4-a716-446655440001 | Senior React Developer     | Alice       | interviewing| 2026-06-21</w:t>
+        <w:t xml:space="preserve"> 990e8400-e29b-41d4-a716-446655440001 | Senior React Developer     | Tanvir       | interviewing| 2026-06-21</w:t>
       </w:r>
       <w:r>
         <w:br/>
@@ -21942,7 +21961,7 @@
         <w:rPr>
           <w:rStyle w:val="VerbatimChar"/>
         </w:rPr>
-        <w:t xml:space="preserve"> 990e8400-e29b-41d4-a716-446655440002 | Senior React Developer     | Jack        | reviewing   | 2026-06-23</w:t>
+        <w:t xml:space="preserve"> 990e8400-e29b-41d4-a716-446655440002 | Senior React Developer     | Mohammad        | reviewing   | 2026-06-23</w:t>
       </w:r>
       <w:r>
         <w:br/>
@@ -21951,7 +21970,7 @@
         <w:rPr>
           <w:rStyle w:val="VerbatimChar"/>
         </w:rPr>
-        <w:t xml:space="preserve"> 990e8400-e29b-41d4-a716-446655440003 | Backend Engineer           | Bob         | pending     | 2026-06-24</w:t>
+        <w:t xml:space="preserve"> 990e8400-e29b-41d4-a716-446655440003 | Backend Engineer           | Sadia         | pending     | 2026-06-24</w:t>
       </w:r>
       <w:r>
         <w:br/>
@@ -21960,7 +21979,7 @@
         <w:rPr>
           <w:rStyle w:val="VerbatimChar"/>
         </w:rPr>
-        <w:t xml:space="preserve"> 990e8400-e29b-41d4-a716-446655440004 | Machine Learning Engineer  | Charlie     | offered     | 2026-06-25</w:t>
+        <w:t xml:space="preserve"> 990e8400-e29b-41d4-a716-446655440004 | Machine Learning Engineer  | Rakib     | offered     | 2026-06-25</w:t>
       </w:r>
       <w:r>
         <w:br/>
@@ -21969,7 +21988,7 @@
         <w:rPr>
           <w:rStyle w:val="VerbatimChar"/>
         </w:rPr>
-        <w:t xml:space="preserve"> 990e8400-e29b-41d4-a716-446655440005 | UI/UX Designer             | Grace       | reviewing   | 2026-06-27</w:t>
+        <w:t xml:space="preserve"> 990e8400-e29b-41d4-a716-446655440005 | UI/UX Designer             | Niloy       | reviewing   | 2026-06-27</w:t>
       </w:r>
       <w:r>
         <w:br/>
@@ -21978,7 +21997,7 @@
         <w:rPr>
           <w:rStyle w:val="VerbatimChar"/>
         </w:rPr>
-        <w:t xml:space="preserve"> 990e8400-e29b-41d4-a716-446655440006 | DevOps Engineer            | Henry       | interviewing| 2026-06-29</w:t>
+        <w:t xml:space="preserve"> 990e8400-e29b-41d4-a716-446655440006 | DevOps Engineer            | Sakhawat       | interviewing| 2026-06-29</w:t>
       </w:r>
       <w:r>
         <w:br/>
@@ -21987,7 +22006,7 @@
         <w:rPr>
           <w:rStyle w:val="VerbatimChar"/>
         </w:rPr>
-        <w:t xml:space="preserve"> 990e8400-e29b-41d4-a716-446655440007 | Backend Engineer           | Jack        | pending     | 2026-06-30</w:t>
+        <w:t xml:space="preserve"> 990e8400-e29b-41d4-a716-446655440007 | Backend Engineer           | Mohammad        | pending     | 2026-06-30</w:t>
       </w:r>
       <w:r>
         <w:br/>
@@ -21996,7 +22015,7 @@
         <w:rPr>
           <w:rStyle w:val="VerbatimChar"/>
         </w:rPr>
-        <w:t xml:space="preserve"> 990e8400-e29b-41d4-a716-446655440008 | Senior React Developer     | Charlie     | rejected    | 2026-06-26</w:t>
+        <w:t xml:space="preserve"> 990e8400-e29b-41d4-a716-446655440008 | Senior React Developer     | Rakib     | rejected    | 2026-06-26</w:t>
       </w:r>
     </w:p>
     <w:bookmarkEnd w:id="51"/>
@@ -23346,7 +23365,7 @@
         <w:rPr>
           <w:rStyle w:val="VerbatimChar"/>
         </w:rPr>
-        <w:t xml:space="preserve"> 990e...001     | Senior React Developer   | Alice Johnson   | interviewing | San Francisco, CA  | 2026-06-21</w:t>
+        <w:t xml:space="preserve"> 990e...001     | Senior React Developer   | Tanvir Rahman   | interviewing | Dhaka, Bangladesh  | 2026-06-21</w:t>
       </w:r>
       <w:r>
         <w:br/>
@@ -23355,7 +23374,7 @@
         <w:rPr>
           <w:rStyle w:val="VerbatimChar"/>
         </w:rPr>
-        <w:t xml:space="preserve"> 990e...002     | Senior React Developer   | Jack Davis      | reviewing    | San Francisco, CA  | 2026-06-23</w:t>
+        <w:t xml:space="preserve"> 990e...002     | Senior React Developer   | Mohammad Sakhawat      | reviewing    | Dhaka, Bangladesh  | 2026-06-23</w:t>
       </w:r>
       <w:r>
         <w:br/>
@@ -23364,7 +23383,7 @@
         <w:rPr>
           <w:rStyle w:val="VerbatimChar"/>
         </w:rPr>
-        <w:t xml:space="preserve"> 990e...003     | Backend Engineer         | Bob Smith       | pending      | Remote             | 2026-06-24</w:t>
+        <w:t xml:space="preserve"> 990e...003     | Backend Engineer         | Sadia Begum       | pending      | Remote             | 2026-06-24</w:t>
       </w:r>
       <w:r>
         <w:br/>
@@ -23373,7 +23392,7 @@
         <w:rPr>
           <w:rStyle w:val="VerbatimChar"/>
         </w:rPr>
-        <w:t xml:space="preserve"> 990e...004     | Machine Learning Engine  | Charlie Brown   | offered      | Boston, MA         | 2026-06-25</w:t>
+        <w:t xml:space="preserve"> 990e...004     | Machine Learning Engine  | Rakib Ghosh   | offered      | Sylhet, Bangladesh         | 2026-06-25</w:t>
       </w:r>
       <w:r>
         <w:br/>
@@ -23382,7 +23401,7 @@
         <w:rPr>
           <w:rStyle w:val="VerbatimChar"/>
         </w:rPr>
-        <w:t xml:space="preserve"> 990e...005     | UI/UX Designer           | Grace Lee       | reviewing    | Seattle, WA        | 2026-06-27</w:t>
+        <w:t xml:space="preserve"> 990e...005     | UI/UX Designer           | Niloy Mukherjee       | reviewing    | Gulshan, Dhaka        | 2026-06-27</w:t>
       </w:r>
     </w:p>
     <w:bookmarkEnd w:id="55"/>
@@ -23728,7 +23747,7 @@
         <w:rPr>
           <w:rStyle w:val="VerbatimChar"/>
         </w:rPr>
-        <w:t xml:space="preserve"> CloudStack          | AWS                  | Engineering</w:t>
+        <w:t xml:space="preserve"> Enosis Solutions          | AWS                  | Engineering</w:t>
       </w:r>
       <w:r>
         <w:br/>
@@ -23737,7 +23756,7 @@
         <w:rPr>
           <w:rStyle w:val="VerbatimChar"/>
         </w:rPr>
-        <w:t xml:space="preserve"> CloudStack          | Data Analysis        | Data &amp; AI</w:t>
+        <w:t xml:space="preserve"> Enosis Solutions          | Data Analysis        | Data &amp; AI</w:t>
       </w:r>
       <w:r>
         <w:br/>
@@ -23746,7 +23765,7 @@
         <w:rPr>
           <w:rStyle w:val="VerbatimChar"/>
         </w:rPr>
-        <w:t xml:space="preserve"> CloudStack          | Docker               | Engineering</w:t>
+        <w:t xml:space="preserve"> Enosis Solutions          | Docker               | Engineering</w:t>
       </w:r>
       <w:r>
         <w:br/>
@@ -23755,7 +23774,7 @@
         <w:rPr>
           <w:rStyle w:val="VerbatimChar"/>
         </w:rPr>
-        <w:t xml:space="preserve"> CloudStack          | Java                 | Engineering</w:t>
+        <w:t xml:space="preserve"> Enosis Solutions          | Java                 | Engineering</w:t>
       </w:r>
       <w:r>
         <w:br/>
@@ -23764,7 +23783,7 @@
         <w:rPr>
           <w:rStyle w:val="VerbatimChar"/>
         </w:rPr>
-        <w:t xml:space="preserve"> CloudStack          | JavaScript           | Engineering</w:t>
+        <w:t xml:space="preserve"> Enosis Solutions          | JavaScript           | Engineering</w:t>
       </w:r>
       <w:r>
         <w:br/>
@@ -23773,7 +23792,7 @@
         <w:rPr>
           <w:rStyle w:val="VerbatimChar"/>
         </w:rPr>
-        <w:t xml:space="preserve"> CloudStack          | Machine Learning     | Data &amp; AI</w:t>
+        <w:t xml:space="preserve"> Enosis Solutions          | Machine Learning     | Data &amp; AI</w:t>
       </w:r>
       <w:r>
         <w:br/>
@@ -23782,7 +23801,7 @@
         <w:rPr>
           <w:rStyle w:val="VerbatimChar"/>
         </w:rPr>
-        <w:t xml:space="preserve"> CloudStack          | Python               | Engineering</w:t>
+        <w:t xml:space="preserve"> Enosis Solutions          | Python               | Engineering</w:t>
       </w:r>
       <w:r>
         <w:br/>
@@ -23791,7 +23810,7 @@
         <w:rPr>
           <w:rStyle w:val="VerbatimChar"/>
         </w:rPr>
-        <w:t xml:space="preserve"> CloudStack          | PostgreSQL           | Engineering</w:t>
+        <w:t xml:space="preserve"> Enosis Solutions          | PostgreSQL           | Engineering</w:t>
       </w:r>
       <w:r>
         <w:br/>
@@ -23800,7 +23819,7 @@
         <w:rPr>
           <w:rStyle w:val="VerbatimChar"/>
         </w:rPr>
-        <w:t xml:space="preserve"> DataViz Corp        | AWS                  | Engineering</w:t>
+        <w:t xml:space="preserve"> TigerIT        | AWS                  | Engineering</w:t>
       </w:r>
       <w:r>
         <w:br/>
@@ -23809,7 +23828,7 @@
         <w:rPr>
           <w:rStyle w:val="VerbatimChar"/>
         </w:rPr>
-        <w:t xml:space="preserve"> DataViz Corp        | Data Analysis        | Data &amp; AI</w:t>
+        <w:t xml:space="preserve"> TigerIT        | Data Analysis        | Data &amp; AI</w:t>
       </w:r>
     </w:p>
     <w:bookmarkEnd w:id="56"/>
@@ -24368,7 +24387,7 @@
         <w:rPr>
           <w:rStyle w:val="VerbatimChar"/>
         </w:rPr>
-        <w:t xml:space="preserve"> 880e...001 | Senior React Developer   | TechCorp Industries | open   | 3                 | 3</w:t>
+        <w:t xml:space="preserve"> 880e...001 | Senior React Developer   | Pathao | open   | 3                 | 3</w:t>
       </w:r>
       <w:r>
         <w:br/>
@@ -24377,7 +24396,7 @@
         <w:rPr>
           <w:rStyle w:val="VerbatimChar"/>
         </w:rPr>
-        <w:t xml:space="preserve"> 880e...002 | Backend Engineer         | TechCorp Industries | open   | 2                 | 2</w:t>
+        <w:t xml:space="preserve"> 880e...002 | Backend Engineer         | Pathao | open   | 2                 | 2</w:t>
       </w:r>
       <w:r>
         <w:br/>
@@ -24386,7 +24405,7 @@
         <w:rPr>
           <w:rStyle w:val="VerbatimChar"/>
         </w:rPr>
-        <w:t xml:space="preserve"> 880e...003 | Machine Learning Engineer| InnovateLabs        | open   | 1                 | 1</w:t>
+        <w:t xml:space="preserve"> 880e...003 | Machine Learning Engineer| bKash        | open   | 1                 | 1</w:t>
       </w:r>
       <w:r>
         <w:br/>
@@ -24395,7 +24414,7 @@
         <w:rPr>
           <w:rStyle w:val="VerbatimChar"/>
         </w:rPr>
-        <w:t xml:space="preserve"> 880e...005 | DevOps Engineer          | CloudStack          | open   | 1                 | 1</w:t>
+        <w:t xml:space="preserve"> 880e...005 | DevOps Engineer          | Enosis Solutions          | open   | 1                 | 1</w:t>
       </w:r>
       <w:r>
         <w:br/>
@@ -24404,7 +24423,7 @@
         <w:rPr>
           <w:rStyle w:val="VerbatimChar"/>
         </w:rPr>
-        <w:t xml:space="preserve"> 880e...004 | UI/UX Designer           | DesignStudio        | open   | 1                 | 1</w:t>
+        <w:t xml:space="preserve"> 880e...004 | UI/UX Designer           | Brain Station 23        | open   | 1                 | 1</w:t>
       </w:r>
       <w:r>
         <w:br/>
@@ -24413,7 +24432,7 @@
         <w:rPr>
           <w:rStyle w:val="VerbatimChar"/>
         </w:rPr>
-        <w:t xml:space="preserve"> 880e...006 | Python Developer         | TechCorp Industries | closed | 0                 | 0</w:t>
+        <w:t xml:space="preserve"> 880e...006 | Python Developer         | Pathao | closed | 0                 | 0</w:t>
       </w:r>
     </w:p>
     <w:bookmarkEnd w:id="57"/>
@@ -25104,7 +25123,7 @@
         <w:rPr>
           <w:rStyle w:val="VerbatimChar"/>
         </w:rPr>
-        <w:t xml:space="preserve"> Alice Johnson   | React                | Engineering    | 3.5                | expert</w:t>
+        <w:t xml:space="preserve"> Tanvir Rahman   | React                | Engineering    | 3.5                | expert</w:t>
       </w:r>
       <w:r>
         <w:br/>
@@ -25113,7 +25132,7 @@
         <w:rPr>
           <w:rStyle w:val="VerbatimChar"/>
         </w:rPr>
-        <w:t xml:space="preserve"> Alice Johnson   | JavaScript           | Engineering    | 4.0                | expert</w:t>
+        <w:t xml:space="preserve"> Tanvir Rahman   | JavaScript           | Engineering    | 4.0                | expert</w:t>
       </w:r>
       <w:r>
         <w:br/>
@@ -25122,7 +25141,7 @@
         <w:rPr>
           <w:rStyle w:val="VerbatimChar"/>
         </w:rPr>
-        <w:t xml:space="preserve"> Charlie Brown   | Data Analysis        | Data &amp; AI      | 5.0                | expert</w:t>
+        <w:t xml:space="preserve"> Rakib Ghosh   | Data Analysis        | Data &amp; AI      | 5.0                | expert</w:t>
       </w:r>
       <w:r>
         <w:br/>
@@ -25131,7 +25150,7 @@
         <w:rPr>
           <w:rStyle w:val="VerbatimChar"/>
         </w:rPr>
-        <w:t xml:space="preserve"> Charlie Brown   | Machine Learning     | Data &amp; AI      | 4.0                | expert</w:t>
+        <w:t xml:space="preserve"> Rakib Ghosh   | Machine Learning     | Data &amp; AI      | 4.0                | expert</w:t>
       </w:r>
       <w:r>
         <w:br/>
@@ -25140,7 +25159,7 @@
         <w:rPr>
           <w:rStyle w:val="VerbatimChar"/>
         </w:rPr>
-        <w:t xml:space="preserve"> Charlie Brown   | Python               | Engineering    | 5.0                | expert</w:t>
+        <w:t xml:space="preserve"> Rakib Ghosh   | Python               | Engineering    | 5.0                | expert</w:t>
       </w:r>
       <w:r>
         <w:br/>
@@ -25149,7 +25168,7 @@
         <w:rPr>
           <w:rStyle w:val="VerbatimChar"/>
         </w:rPr>
-        <w:t xml:space="preserve"> Grace Lee       | Figma                | Design         | 3.0                | expert</w:t>
+        <w:t xml:space="preserve"> Niloy Mukherjee       | Figma                | Design         | 3.0                | expert</w:t>
       </w:r>
       <w:r>
         <w:br/>
@@ -25158,7 +25177,7 @@
         <w:rPr>
           <w:rStyle w:val="VerbatimChar"/>
         </w:rPr>
-        <w:t xml:space="preserve"> Grace Lee       | UI/UX Design         | Design         | 3.0                | expert</w:t>
+        <w:t xml:space="preserve"> Niloy Mukherjee       | UI/UX Design         | Design         | 3.0                | expert</w:t>
       </w:r>
       <w:r>
         <w:br/>
@@ -25167,7 +25186,7 @@
         <w:rPr>
           <w:rStyle w:val="VerbatimChar"/>
         </w:rPr>
-        <w:t xml:space="preserve"> Henry Wilson    | Docker               | Engineering    | 3.0                | expert</w:t>
+        <w:t xml:space="preserve"> Sakhawat Hosen    | Docker               | Engineering    | 3.0                | expert</w:t>
       </w:r>
       <w:r>
         <w:br/>
@@ -25176,7 +25195,7 @@
         <w:rPr>
           <w:rStyle w:val="VerbatimChar"/>
         </w:rPr>
-        <w:t xml:space="preserve"> Henry Wilson    | AWS                  | Engineering    | 2.5                | expert</w:t>
+        <w:t xml:space="preserve"> Sakhawat Hosen    | AWS                  | Engineering    | 2.5                | expert</w:t>
       </w:r>
       <w:r>
         <w:br/>
@@ -25185,7 +25204,7 @@
         <w:rPr>
           <w:rStyle w:val="VerbatimChar"/>
         </w:rPr>
-        <w:t xml:space="preserve"> Jack Davis      | JavaScript           | Engineering    | 2.0                | expert</w:t>
+        <w:t xml:space="preserve"> Mohammad Sakhawat      | JavaScript           | Engineering    | 2.0                | expert</w:t>
       </w:r>
       <w:r>
         <w:br/>
@@ -25194,7 +25213,7 @@
         <w:rPr>
           <w:rStyle w:val="VerbatimChar"/>
         </w:rPr>
-        <w:t xml:space="preserve"> Jack Davis      | React                | Engineering    | 2.0                | expert</w:t>
+        <w:t xml:space="preserve"> Mohammad Sakhawat      | React                | Engineering    | 2.0                | expert</w:t>
       </w:r>
     </w:p>
     <w:bookmarkEnd w:id="58"/>
@@ -26113,7 +26132,7 @@
         <w:rPr>
           <w:rStyle w:val="VerbatimChar"/>
         </w:rPr>
-        <w:t xml:space="preserve"> 660e...001 | TechCorp Industries | Technology     | 2010</w:t>
+        <w:t xml:space="preserve"> 660e...001 | Pathao | Technology     | 2010</w:t>
       </w:r>
       <w:r>
         <w:br/>
@@ -26122,7 +26141,7 @@
         <w:rPr>
           <w:rStyle w:val="VerbatimChar"/>
         </w:rPr>
-        <w:t xml:space="preserve"> 660e...002 | InnovateLabs        | Software/AI    | 2015</w:t>
+        <w:t xml:space="preserve"> 660e...002 | bKash        | Software/AI    | 2015</w:t>
       </w:r>
       <w:r>
         <w:br/>
@@ -26131,7 +26150,7 @@
         <w:rPr>
           <w:rStyle w:val="VerbatimChar"/>
         </w:rPr>
-        <w:t xml:space="preserve"> 660e...003 | DesignStudio        | Design/Creativ | 2012</w:t>
+        <w:t xml:space="preserve"> 660e...003 | Brain Station 23        | Design/Creativ | 2012</w:t>
       </w:r>
       <w:r>
         <w:br/>
@@ -26140,7 +26159,7 @@
         <w:rPr>
           <w:rStyle w:val="VerbatimChar"/>
         </w:rPr>
-        <w:t xml:space="preserve"> 660e...005 | CloudStack          | Cloud Services | 2008</w:t>
+        <w:t xml:space="preserve"> 660e...005 | Enosis Solutions          | Cloud Services | 2008</w:t>
       </w:r>
     </w:p>
     <w:bookmarkEnd w:id="61"/>
@@ -26763,7 +26782,7 @@
         <w:rPr>
           <w:rStyle w:val="VerbatimChar"/>
         </w:rPr>
-        <w:t xml:space="preserve"> Alice Johnson   | 1</w:t>
+        <w:t xml:space="preserve"> Tanvir Rahman   | 1</w:t>
       </w:r>
       <w:r>
         <w:br/>
@@ -26772,7 +26791,7 @@
         <w:rPr>
           <w:rStyle w:val="VerbatimChar"/>
         </w:rPr>
-        <w:t xml:space="preserve"> Grace Lee       | 1</w:t>
+        <w:t xml:space="preserve"> Niloy Mukherjee       | 1</w:t>
       </w:r>
     </w:p>
     <w:bookmarkEnd w:id="62"/>
@@ -27155,7 +27174,7 @@
         <w:rPr>
           <w:rStyle w:val="VerbatimChar"/>
         </w:rPr>
-        <w:t xml:space="preserve"> Machine Learning Engineer| InnovateLabs        | 130000     | 160000</w:t>
+        <w:t xml:space="preserve"> Machine Learning Engineer| bKash        | 130000     | 160000</w:t>
       </w:r>
       <w:r>
         <w:br/>
@@ -27164,7 +27183,7 @@
         <w:rPr>
           <w:rStyle w:val="VerbatimChar"/>
         </w:rPr>
-        <w:t xml:space="preserve"> Senior React Developer   | TechCorp Industries | 120000     | 150000</w:t>
+        <w:t xml:space="preserve"> Senior React Developer   | Pathao | 120000     | 150000</w:t>
       </w:r>
       <w:r>
         <w:br/>
@@ -27173,7 +27192,7 @@
         <w:rPr>
           <w:rStyle w:val="VerbatimChar"/>
         </w:rPr>
-        <w:t xml:space="preserve"> DevOps Engineer          | CloudStack          | 110000     | 140000</w:t>
+        <w:t xml:space="preserve"> DevOps Engineer          | Enosis Solutions          | 110000     | 140000</w:t>
       </w:r>
       <w:r>
         <w:br/>
@@ -27182,7 +27201,7 @@
         <w:rPr>
           <w:rStyle w:val="VerbatimChar"/>
         </w:rPr>
-        <w:t xml:space="preserve"> Backend Engineer         | TechCorp Industries | 100000     | 130000</w:t>
+        <w:t xml:space="preserve"> Backend Engineer         | Pathao | 100000     | 130000</w:t>
       </w:r>
     </w:p>
     <w:bookmarkEnd w:id="63"/>
@@ -27790,7 +27809,7 @@
         <w:rPr>
           <w:rStyle w:val="VerbatimChar"/>
         </w:rPr>
-        <w:t xml:space="preserve"> Charlie Brown   | 4.67</w:t>
+        <w:t xml:space="preserve"> Rakib Ghosh   | 4.67</w:t>
       </w:r>
       <w:r>
         <w:br/>
@@ -27799,7 +27818,7 @@
         <w:rPr>
           <w:rStyle w:val="VerbatimChar"/>
         </w:rPr>
-        <w:t xml:space="preserve"> Alice Johnson   | 3.5</w:t>
+        <w:t xml:space="preserve"> Tanvir Rahman   | 3.5</w:t>
       </w:r>
     </w:p>
     <w:bookmarkEnd w:id="64"/>
@@ -28194,7 +28213,7 @@
         <w:rPr>
           <w:rStyle w:val="VerbatimChar"/>
         </w:rPr>
-        <w:t xml:space="preserve"> InnovateLabs        | Software/AI</w:t>
+        <w:t xml:space="preserve"> bKash        | Software/AI</w:t>
       </w:r>
       <w:r>
         <w:br/>
@@ -28203,7 +28222,7 @@
         <w:rPr>
           <w:rStyle w:val="VerbatimChar"/>
         </w:rPr>
-        <w:t xml:space="preserve"> TechCorp Industries | Technology</w:t>
+        <w:t xml:space="preserve"> Pathao | Technology</w:t>
       </w:r>
     </w:p>
     <w:bookmarkEnd w:id="65"/>
@@ -29824,7 +29843,7 @@
         <w:rPr>
           <w:rStyle w:val="VerbatimChar"/>
         </w:rPr>
-        <w:t xml:space="preserve"> 990e...004     | Machine Learning Engineer| Charlie Brown   | offered      | 130000     | 160000</w:t>
+        <w:t xml:space="preserve"> 990e...004     | Machine Learning Engineer| Rakib Ghosh   | offered      | 130000     | 160000</w:t>
       </w:r>
       <w:r>
         <w:br/>
@@ -29833,7 +29852,7 @@
         <w:rPr>
           <w:rStyle w:val="VerbatimChar"/>
         </w:rPr>
-        <w:t xml:space="preserve"> 990e...001     | Senior React Developer   | Alice Johnson   | interviewing | 120000     | 150000</w:t>
+        <w:t xml:space="preserve"> 990e...001     | Senior React Developer   | Tanvir Rahman   | interviewing | 120000     | 150000</w:t>
       </w:r>
       <w:r>
         <w:br/>
@@ -29842,7 +29861,7 @@
         <w:rPr>
           <w:rStyle w:val="VerbatimChar"/>
         </w:rPr>
-        <w:t xml:space="preserve"> 990e...006     | DevOps Engineer          | Henry Wilson    | interviewing | 110000     | 140000</w:t>
+        <w:t xml:space="preserve"> 990e...006     | DevOps Engineer          | Sakhawat Hosen    | interviewing | 110000     | 140000</w:t>
       </w:r>
     </w:p>
     <w:bookmarkEnd w:id="69"/>
@@ -31011,7 +31030,7 @@
         <w:rPr>
           <w:rStyle w:val="VerbatimChar"/>
         </w:rPr>
-        <w:t xml:space="preserve"> Alice Johnson   | 100                           | 3          | 1</w:t>
+        <w:t xml:space="preserve"> Tanvir Rahman   | 100                           | 3          | 1</w:t>
       </w:r>
       <w:r>
         <w:br/>
@@ -31020,7 +31039,7 @@
         <w:rPr>
           <w:rStyle w:val="VerbatimChar"/>
         </w:rPr>
-        <w:t xml:space="preserve"> Bob Smith       | 100                           | 3          | 1</w:t>
+        <w:t xml:space="preserve"> Sadia Begum       | 100                           | 3          | 1</w:t>
       </w:r>
       <w:r>
         <w:br/>
@@ -31029,7 +31048,7 @@
         <w:rPr>
           <w:rStyle w:val="VerbatimChar"/>
         </w:rPr>
-        <w:t xml:space="preserve"> Charlie Brown   | 100                           | 3          | 2</w:t>
+        <w:t xml:space="preserve"> Rakib Ghosh   | 100                           | 3          | 2</w:t>
       </w:r>
       <w:r>
         <w:br/>
@@ -31038,7 +31057,7 @@
         <w:rPr>
           <w:rStyle w:val="VerbatimChar"/>
         </w:rPr>
-        <w:t xml:space="preserve"> Grace Lee       | 80                            | 2          | 1</w:t>
+        <w:t xml:space="preserve"> Niloy Mukherjee       | 80                            | 2          | 1</w:t>
       </w:r>
       <w:r>
         <w:br/>
@@ -31047,7 +31066,7 @@
         <w:rPr>
           <w:rStyle w:val="VerbatimChar"/>
         </w:rPr>
-        <w:t xml:space="preserve"> Henry Wilson    | 100                           | 2          | 1</w:t>
+        <w:t xml:space="preserve"> Sakhawat Hosen    | 100                           | 2          | 1</w:t>
       </w:r>
       <w:r>
         <w:br/>
@@ -31056,7 +31075,7 @@
         <w:rPr>
           <w:rStyle w:val="VerbatimChar"/>
         </w:rPr>
-        <w:t xml:space="preserve"> Jack Davis      | 100                           | 3          | 2</w:t>
+        <w:t xml:space="preserve"> Mohammad Sakhawat      | 100                           | 3          | 2</w:t>
       </w:r>
     </w:p>
     <w:bookmarkEnd w:id="70"/>
@@ -32417,7 +32436,7 @@
         <w:rPr>
           <w:rStyle w:val="VerbatimChar"/>
         </w:rPr>
-        <w:t xml:space="preserve"> 990e...004 | Machine Learning Engineer  | Charlie Brown   | offered      | 2026-06-25 | 1</w:t>
+        <w:t xml:space="preserve"> 990e...004 | Machine Learning Engineer  | Rakib Ghosh   | offered      | 2026-06-25 | 1</w:t>
       </w:r>
       <w:r>
         <w:br/>
@@ -32426,7 +32445,7 @@
         <w:rPr>
           <w:rStyle w:val="VerbatimChar"/>
         </w:rPr>
-        <w:t xml:space="preserve"> 990e...001 | Senior React Developer     | Alice Johnson   | interviewing | 2026-06-21 | 2</w:t>
+        <w:t xml:space="preserve"> 990e...001 | Senior React Developer     | Tanvir Rahman   | interviewing | 2026-06-21 | 2</w:t>
       </w:r>
       <w:r>
         <w:br/>
@@ -32435,7 +32454,7 @@
         <w:rPr>
           <w:rStyle w:val="VerbatimChar"/>
         </w:rPr>
-        <w:t xml:space="preserve"> 990e...006 | DevOps Engineer            | Henry Wilson    | interviewing | 2026-06-29 | 2</w:t>
+        <w:t xml:space="preserve"> 990e...006 | DevOps Engineer            | Sakhawat Hosen    | interviewing | 2026-06-29 | 2</w:t>
       </w:r>
       <w:r>
         <w:br/>
@@ -32444,7 +32463,7 @@
         <w:rPr>
           <w:rStyle w:val="VerbatimChar"/>
         </w:rPr>
-        <w:t xml:space="preserve"> 990e...002 | Senior React Developer     | Jack Davis      | reviewing    | 2026-06-23 | 3</w:t>
+        <w:t xml:space="preserve"> 990e...002 | Senior React Developer     | Mohammad Sakhawat      | reviewing    | 2026-06-23 | 3</w:t>
       </w:r>
       <w:r>
         <w:br/>
@@ -32453,7 +32472,7 @@
         <w:rPr>
           <w:rStyle w:val="VerbatimChar"/>
         </w:rPr>
-        <w:t xml:space="preserve"> 990e...005 | UI/UX Designer             | Grace Lee       | reviewing    | 2026-06-27 | 3</w:t>
+        <w:t xml:space="preserve"> 990e...005 | UI/UX Designer             | Niloy Mukherjee       | reviewing    | 2026-06-27 | 3</w:t>
       </w:r>
       <w:r>
         <w:br/>
@@ -32462,7 +32481,7 @@
         <w:rPr>
           <w:rStyle w:val="VerbatimChar"/>
         </w:rPr>
-        <w:t xml:space="preserve"> 990e...003 | Backend Engineer           | Bob Smith       | pending      | 2026-06-24 | 4</w:t>
+        <w:t xml:space="preserve"> 990e...003 | Backend Engineer           | Sadia Begum       | pending      | 2026-06-24 | 4</w:t>
       </w:r>
       <w:r>
         <w:br/>
@@ -32471,7 +32490,7 @@
         <w:rPr>
           <w:rStyle w:val="VerbatimChar"/>
         </w:rPr>
-        <w:t xml:space="preserve"> 990e...007 | Backend Engineer           | Jack Davis      | pending      | 2026-06-30 | 4</w:t>
+        <w:t xml:space="preserve"> 990e...007 | Backend Engineer           | Mohammad Sakhawat      | pending      | 2026-06-30 | 4</w:t>
       </w:r>
       <w:r>
         <w:br/>
@@ -32480,7 +32499,7 @@
         <w:rPr>
           <w:rStyle w:val="VerbatimChar"/>
         </w:rPr>
-        <w:t xml:space="preserve"> 990e...008 | Senior React Developer     | Charlie Brown   | rejected     | 2026-06-26 | 5</w:t>
+        <w:t xml:space="preserve"> 990e...008 | Senior React Developer     | Rakib Ghosh   | rejected     | 2026-06-26 | 5</w:t>
       </w:r>
     </w:p>
     <w:bookmarkEnd w:id="73"/>
@@ -33344,7 +33363,7 @@
         <w:rPr>
           <w:rStyle w:val="VerbatimChar"/>
         </w:rPr>
-        <w:t xml:space="preserve"> TechCorp Industries | 2         | 3          | 66.7</w:t>
+        <w:t xml:space="preserve"> Pathao | 2         | 3          | 66.7</w:t>
       </w:r>
       <w:r>
         <w:br/>
@@ -33353,7 +33372,7 @@
         <w:rPr>
           <w:rStyle w:val="VerbatimChar"/>
         </w:rPr>
-        <w:t xml:space="preserve"> InnovateLabs        | 1         | 1          | 100.0</w:t>
+        <w:t xml:space="preserve"> bKash        | 1         | 1          | 100.0</w:t>
       </w:r>
       <w:r>
         <w:br/>
@@ -33362,7 +33381,7 @@
         <w:rPr>
           <w:rStyle w:val="VerbatimChar"/>
         </w:rPr>
-        <w:t xml:space="preserve"> DesignStudio        | 1         | 1          | 100.0</w:t>
+        <w:t xml:space="preserve"> Brain Station 23        | 1         | 1          | 100.0</w:t>
       </w:r>
       <w:r>
         <w:br/>
@@ -33371,7 +33390,7 @@
         <w:rPr>
           <w:rStyle w:val="VerbatimChar"/>
         </w:rPr>
-        <w:t xml:space="preserve"> CloudStack          | 1         | 1          | 100.0</w:t>
+        <w:t xml:space="preserve"> Enosis Solutions          | 1         | 1          | 100.0</w:t>
       </w:r>
     </w:p>
     <w:bookmarkEnd w:id="75"/>
@@ -35056,7 +35075,7 @@
         <w:rPr>
           <w:rStyle w:val="VerbatimChar"/>
         </w:rPr>
-        <w:t xml:space="preserve"> Alice Johnson   | Senior React Developer     | 3             | 2              | 100.0</w:t>
+        <w:t xml:space="preserve"> Tanvir Rahman   | Senior React Developer     | 3             | 2              | 100.0</w:t>
       </w:r>
       <w:r>
         <w:br/>
@@ -35065,7 +35084,7 @@
         <w:rPr>
           <w:rStyle w:val="VerbatimChar"/>
         </w:rPr>
-        <w:t xml:space="preserve"> Jack Davis      | Senior React Developer     | 3             | 2              | 100.0</w:t>
+        <w:t xml:space="preserve"> Mohammad Sakhawat      | Senior React Developer     | 3             | 2              | 100.0</w:t>
       </w:r>
       <w:r>
         <w:br/>
@@ -35074,7 +35093,7 @@
         <w:rPr>
           <w:rStyle w:val="VerbatimChar"/>
         </w:rPr>
-        <w:t xml:space="preserve"> Bob Smith       | Backend Engineer           | 3             | 2              | 66.7</w:t>
+        <w:t xml:space="preserve"> Sadia Begum       | Backend Engineer           | 3             | 2              | 66.7</w:t>
       </w:r>
       <w:r>
         <w:br/>
@@ -35083,7 +35102,7 @@
         <w:rPr>
           <w:rStyle w:val="VerbatimChar"/>
         </w:rPr>
-        <w:t xml:space="preserve"> Henry Wilson    | DevOps Engineer            | 2             | 2              | 100.0</w:t>
+        <w:t xml:space="preserve"> Sakhawat Hosen    | DevOps Engineer            | 2             | 2              | 100.0</w:t>
       </w:r>
       <w:r>
         <w:br/>
@@ -35092,7 +35111,7 @@
         <w:rPr>
           <w:rStyle w:val="VerbatimChar"/>
         </w:rPr>
-        <w:t xml:space="preserve"> Grace Lee       | UI/UX Designer             | 2             | 2              | 100.0</w:t>
+        <w:t xml:space="preserve"> Niloy Mukherjee       | UI/UX Designer             | 2             | 2              | 100.0</w:t>
       </w:r>
       <w:r>
         <w:br/>
@@ -35101,7 +35120,7 @@
         <w:rPr>
           <w:rStyle w:val="VerbatimChar"/>
         </w:rPr>
-        <w:t xml:space="preserve"> Charlie Brown   | Machine Learning Engineer  | 3             | 3              | 100.0</w:t>
+        <w:t xml:space="preserve"> Rakib Ghosh   | Machine Learning Engineer  | 3             | 3              | 100.0</w:t>
       </w:r>
       <w:r>
         <w:br/>
@@ -35110,7 +35129,7 @@
         <w:rPr>
           <w:rStyle w:val="VerbatimChar"/>
         </w:rPr>
-        <w:t xml:space="preserve"> Alice Johnson   | Backend Engineer           | 3             | 2              | 50.0</w:t>
+        <w:t xml:space="preserve"> Tanvir Rahman   | Backend Engineer           | 3             | 2              | 50.0</w:t>
       </w:r>
     </w:p>
     <w:bookmarkEnd w:id="76"/>
@@ -35887,7 +35906,7 @@
         <w:rPr>
           <w:rStyle w:val="VerbatimChar"/>
         </w:rPr>
-        <w:t xml:space="preserve"> ALICE JOHNSON   | alice.johnson@seekers... | Full Stack Developer    | Passionate about web development ... | 20                | CA</w:t>
+        <w:t xml:space="preserve"> TANVIR RAHMAN   | tanvir.rahman@seekers... | Full Stack Developer    | Passionate about web development ... | 20                | BD</w:t>
       </w:r>
       <w:r>
         <w:br/>
@@ -35896,7 +35915,7 @@
         <w:rPr>
           <w:rStyle w:val="VerbatimChar"/>
         </w:rPr>
-        <w:t xml:space="preserve"> BOB SMITH       | bob.smith@seekers...    | Junior Backend Engineer | Learning Node.js and PostgreSQL      | 18                | NY</w:t>
+        <w:t xml:space="preserve"> SADIA BEGUM       | sadia.begum@seekers...    | Junior Backend Engineer | Learning Node.js and PostgreSQL      | 18                | BD</w:t>
       </w:r>
       <w:r>
         <w:br/>
@@ -35905,7 +35924,7 @@
         <w:rPr>
           <w:rStyle w:val="VerbatimChar"/>
         </w:rPr>
-        <w:t xml:space="preserve"> CHARLIE BROWN   | charlie.brown@seekers...| Data Scientist          | ML specialist with 5 years exper ... | 22                | TX</w:t>
+        <w:t xml:space="preserve"> RAKIB GHOSH   | rakib.ghosh@seekers...| Data Scientist          | ML specialist with 5 years exper ... | 22                | BD</w:t>
       </w:r>
       <w:r>
         <w:br/>
@@ -35914,7 +35933,7 @@
         <w:rPr>
           <w:rStyle w:val="VerbatimChar"/>
         </w:rPr>
-        <w:t xml:space="preserve"> GRACE LEE       | grace.lee@seekers...   | Ui/Ux Designer          | NULL                                 | 0                 | WA</w:t>
+        <w:t xml:space="preserve"> NILOY MUKHERJEE       | niloy.mukherjee@seekers...   | Ui/Ux Designer          | NULL                                 | 0                 | BD</w:t>
       </w:r>
       <w:r>
         <w:br/>
@@ -35923,7 +35942,7 @@
         <w:rPr>
           <w:rStyle w:val="VerbatimChar"/>
         </w:rPr>
-        <w:t xml:space="preserve"> HENRY WILSON    | henry.wilson@seekers...| Devops Engineer         | Docker and Kubernetes specialist     | 21                | MA</w:t>
+        <w:t xml:space="preserve"> SAKHAWAT HOSEN    | sakhawat.hosen@seekers...| Devops Engineer         | Docker and Kubernetes specialist     | 21                | BD</w:t>
       </w:r>
       <w:r>
         <w:br/>
@@ -35932,7 +35951,7 @@
         <w:rPr>
           <w:rStyle w:val="VerbatimChar"/>
         </w:rPr>
-        <w:t xml:space="preserve"> JACK DAVIS      | jack.davis@seekers...  | Full Stack Developer    | React and Python developer           | 19                | CO</w:t>
+        <w:t xml:space="preserve"> MOHAMMAD SAKHAWAT      | mohammad.sakhawat@seekers...  | Full Stack Developer    | React and Python developer           | 19                | BD</w:t>
       </w:r>
     </w:p>
     <w:bookmarkEnd w:id="78"/>
@@ -36543,7 +36562,7 @@
         <w:rPr>
           <w:rStyle w:val="VerbatimChar"/>
         </w:rPr>
-        <w:t xml:space="preserve"> 550e8400-e29b-41d4-a716-446655440001 | alice@seeker.com    | seeker    | Active Recently   | 2026-06-29</w:t>
+        <w:t xml:space="preserve"> 550e8400-e29b-41d4-a716-446655440001 | tanvir@seeker.com    | seeker    | Active Recently   | 2026-06-29</w:t>
       </w:r>
       <w:r>
         <w:br/>
@@ -36552,7 +36571,7 @@
         <w:rPr>
           <w:rStyle w:val="VerbatimChar"/>
         </w:rPr>
-        <w:t xml:space="preserve"> 550e8400-e29b-41d4-a716-446655440003 | charlie@seeker.com  | seeker    | Active Recently   | 2026-07-01</w:t>
+        <w:t xml:space="preserve"> 550e8400-e29b-41d4-a716-446655440003 | rakib@seeker.com  | seeker    | Active Recently   | 2026-07-01</w:t>
       </w:r>
       <w:r>
         <w:br/>
@@ -36561,7 +36580,7 @@
         <w:rPr>
           <w:rStyle w:val="VerbatimChar"/>
         </w:rPr>
-        <w:t xml:space="preserve"> 550e8400-e29b-41d4-a716-446655440004 | diana@employer.com  | employer  | Active Recently   | 2026-07-01</w:t>
+        <w:t xml:space="preserve"> 550e8400-e29b-41d4-a716-446655440004 | nusrat@employer.com  | employer  | Active Recently   | 2026-07-01</w:t>
       </w:r>
       <w:r>
         <w:br/>
@@ -36570,7 +36589,7 @@
         <w:rPr>
           <w:rStyle w:val="VerbatimChar"/>
         </w:rPr>
-        <w:t xml:space="preserve"> 550e8400-e29b-41d4-a716-446655440005 | evan@employer.com   | employer  | Active Recently   | 2026-07-01</w:t>
+        <w:t xml:space="preserve"> 550e8400-e29b-41d4-a716-446655440005 | faysal@employer.com   | employer  | Active Recently   | 2026-07-01</w:t>
       </w:r>
       <w:r>
         <w:br/>
@@ -36579,7 +36598,7 @@
         <w:rPr>
           <w:rStyle w:val="VerbatimChar"/>
         </w:rPr>
-        <w:t xml:space="preserve"> 550e8400-e29b-41d4-a716-446655440009 | isla@employer.com   | employer  | Active Recently   | 2026-07-01</w:t>
+        <w:t xml:space="preserve"> 550e8400-e29b-41d4-a716-446655440009 | animesh@employer.com   | employer  | Active Recently   | 2026-07-01</w:t>
       </w:r>
       <w:r>
         <w:br/>
@@ -36588,7 +36607,7 @@
         <w:rPr>
           <w:rStyle w:val="VerbatimChar"/>
         </w:rPr>
-        <w:t xml:space="preserve"> 550e8400-e29b-41d4-a716-446655440010 | jack@seeker.com     | seeker    | Active Recently   | 2026-07-01</w:t>
+        <w:t xml:space="preserve"> 550e8400-e29b-41d4-a716-446655440010 | mohammad@seeker.com     | seeker    | Active Recently   | 2026-07-01</w:t>
       </w:r>
     </w:p>
     <w:bookmarkEnd w:id="79"/>
@@ -42197,7 +42216,7 @@
         <w:rPr>
           <w:rStyle w:val="VerbatimChar"/>
         </w:rPr>
-        <w:t xml:space="preserve"> 880e8400... | Senior React Developer   | TechCorp Industries | 120000     | 150000     | 3                 | 1</w:t>
+        <w:t xml:space="preserve"> 880e8400... | Senior React Developer   | Pathao | 120000     | 150000     | 3                 | 1</w:t>
       </w:r>
       <w:r>
         <w:br/>
@@ -42206,7 +42225,7 @@
         <w:rPr>
           <w:rStyle w:val="VerbatimChar"/>
         </w:rPr>
-        <w:t xml:space="preserve"> 880e8400... | Backend Engineer         | TechCorp Industries | 100000     | 130000     | 2                 | 0</w:t>
+        <w:t xml:space="preserve"> 880e8400... | Backend Engineer         | Pathao | 100000     | 130000     | 2                 | 0</w:t>
       </w:r>
       <w:r>
         <w:br/>
@@ -42215,7 +42234,7 @@
         <w:rPr>
           <w:rStyle w:val="VerbatimChar"/>
         </w:rPr>
-        <w:t xml:space="preserve"> 880e8400... | Machine Learning Engine  | InnovateLabs        | 130000     | 160000     | 1                 | 0</w:t>
+        <w:t xml:space="preserve"> 880e8400... | Machine Learning Engine  | bKash        | 130000     | 160000     | 1                 | 0</w:t>
       </w:r>
     </w:p>
     <w:bookmarkEnd w:id="91"/>
@@ -44631,7 +44650,7 @@
         <w:rPr>
           <w:rStyle w:val="VerbatimChar"/>
         </w:rPr>
-        <w:t xml:space="preserve"> Alice Johnson  | 100                   | 3           | 1</w:t>
+        <w:t xml:space="preserve"> Tanvir Rahman  | 100                   | 3           | 1</w:t>
       </w:r>
       <w:r>
         <w:br/>
@@ -44640,7 +44659,7 @@
         <w:rPr>
           <w:rStyle w:val="VerbatimChar"/>
         </w:rPr>
-        <w:t xml:space="preserve"> Bob Smith      | 100                   | 3           | 1</w:t>
+        <w:t xml:space="preserve"> Sadia Begum      | 100                   | 3           | 1</w:t>
       </w:r>
       <w:r>
         <w:br/>
@@ -44649,7 +44668,7 @@
         <w:rPr>
           <w:rStyle w:val="VerbatimChar"/>
         </w:rPr>
-        <w:t xml:space="preserve"> Charlie Brown  | 100                   | 3           | 2</w:t>
+        <w:t xml:space="preserve"> Rakib Ghosh  | 100                   | 3           | 2</w:t>
       </w:r>
       <w:r>
         <w:br/>
@@ -44658,7 +44677,7 @@
         <w:rPr>
           <w:rStyle w:val="VerbatimChar"/>
         </w:rPr>
-        <w:t xml:space="preserve"> Jack Davis     | 100                   | 3           | 2</w:t>
+        <w:t xml:space="preserve"> Mohammad Sakhawat     | 100                   | 3           | 2</w:t>
       </w:r>
       <w:r>
         <w:br/>
@@ -44667,7 +44686,7 @@
         <w:rPr>
           <w:rStyle w:val="VerbatimChar"/>
         </w:rPr>
-        <w:t xml:space="preserve"> Grace Lee      | 80                    | 2           | 1</w:t>
+        <w:t xml:space="preserve"> Niloy Mukherjee      | 80                    | 2           | 1</w:t>
       </w:r>
       <w:r>
         <w:br/>
@@ -44676,7 +44695,7 @@
         <w:rPr>
           <w:rStyle w:val="VerbatimChar"/>
         </w:rPr>
-        <w:t xml:space="preserve"> Henry Wilson   | 100                   | 2           | 1</w:t>
+        <w:t xml:space="preserve"> Sakhawat Hosen   | 100                   | 2           | 1</w:t>
       </w:r>
     </w:p>
     <w:bookmarkEnd w:id="92"/>
@@ -48340,6 +48359,28 @@
       <w:r>
         <w:t xml:space="preserve">- Enforces role-based access control via RLS</w:t>
       </w:r>
+      <w:r>
+        <w:br/>
+      </w:r>
+      <w:r>
+        <w:t xml:space="preserve">✓</w:t>
+      </w:r>
+      <w:r>
+        <w:t xml:space="preserve"> </w:t>
+      </w:r>
+      <w:r>
+        <w:rPr>
+          <w:b/>
+          <w:bCs/>
+        </w:rPr>
+        <w:t xml:space="preserve">Bangladeshi Localization</w:t>
+      </w:r>
+      <w:r>
+        <w:t xml:space="preserve"> </w:t>
+      </w:r>
+      <w:r>
+        <w:t xml:space="preserve">- Fully customized with Bangladeshi seeker profiles, tech employers, educational institutions, and geographic locations</w:t>
+      </w:r>
     </w:p>
     <w:bookmarkEnd w:id="110"/>
     <w:bookmarkStart w:id="111" w:name="technical-excellence"/>
@@ -48522,7 +48563,7 @@
         <w:t xml:space="preserve"> </w:t>
       </w:r>
       <w:r>
-        <w:t xml:space="preserve">2026-07-01</w:t>
+        <w:t xml:space="preserve">2026-07-05 (Localized for Bangladesh)</w:t>
       </w:r>
       <w:r>
         <w:br/>

</xml_diff>